<commit_message>
Review fixes: separate cross-identity experiment, fix family panels, clarify suggestibility
- Sectioning: three experiments delineated (volunteer / weights / suggestibility);
  cross-identity 'Are you X?' is now its own section (Experiment 3), not lumped in.
- Cross interpretation corrected: pooled-over-models rate clarified; added the
  key structure (Claude accepts Qwen 18%/DeepSeek 12% but ChatGPT 3%/Gemini 0% --
  accepts what it's contaminated with, mirroring spontaneous drift = validation).
- Family panels: drop all-zero columns (incl. each family's own-name column, which
  was empty and confusing); fold nvidia/doubao into 'other lab' (lab names, not
  model names); shared global vmax + % colorbar so colors mean the same % across
  all panels (was per-panel relative). fig_flow: drop nvidia column.

Co-Authored-By: Claude Opus 4.8 <noreply@anthropic.com>
Claude-Session: https://claude.ai/code/session_01Anj4JvuNgPGS3kunnJgPkZ
</commit_message>
<xml_diff>
--- a/post/what_do_llms_call_themselves.docx
+++ b/post/what_do_llms_call_themselves.docx
@@ -235,7 +235,47 @@
         <w:pStyle w:val="Heading1"/>
       </w:pPr>
       <w:r>
-        <w:t>How common is it?</w:t>
+        <w:t>Three experiments</w:t>
+      </w:r>
+    </w:p>
+    <w:p>
+      <w:r>
+        <w:t xml:space="preserve">The battery supports three distinct experiments, which we report separately and should not be pooled: </w:t>
+      </w:r>
+      <w:r>
+        <w:rPr>
+          <w:b/>
+        </w:rPr>
+        <w:t>(1) what models volunteer</w:t>
+      </w:r>
+      <w:r>
+        <w:t xml:space="preserve"> on open identity questions ("who are you?") — the main survey, next; </w:t>
+      </w:r>
+      <w:r>
+        <w:rPr>
+          <w:b/>
+        </w:rPr>
+        <w:t>(2) what the weights claim</w:t>
+      </w:r>
+      <w:r>
+        <w:t xml:space="preserve"> once the chat template's injected identity is stripped — the raw-weights read, for the open models; and </w:t>
+      </w:r>
+      <w:r>
+        <w:rPr>
+          <w:b/>
+        </w:rPr>
+        <w:t>(3) what they'll accept</w:t>
+      </w:r>
+      <w:r>
+        <w:t xml:space="preserve"> when asked a leading question ("Are you X?") — a suggestibility test.</w:t>
+      </w:r>
+    </w:p>
+    <w:p>
+      <w:pPr>
+        <w:pStyle w:val="Heading1"/>
+      </w:pPr>
+      <w:r>
+        <w:t>Experiment 1 — what models volunteer: how common is it?</w:t>
       </w:r>
     </w:p>
     <w:p>
@@ -563,7 +603,7 @@
       <w:r>
         <w:drawing>
           <wp:inline xmlns:a="http://schemas.openxmlformats.org/drawingml/2006/main" xmlns:pic="http://schemas.openxmlformats.org/drawingml/2006/picture">
-            <wp:extent cx="5852160" cy="3428465"/>
+            <wp:extent cx="5852160" cy="3539553"/>
             <wp:docPr id="4" name="Picture 4"/>
             <wp:cNvGraphicFramePr>
               <a:graphicFrameLocks noChangeAspect="1"/>
@@ -584,7 +624,7 @@
                   <pic:spPr>
                     <a:xfrm>
                       <a:off x="0" y="0"/>
-                      <a:ext cx="5852160" cy="3428465"/>
+                      <a:ext cx="5852160" cy="3539553"/>
                     </a:xfrm>
                     <a:prstGeom prst="rect"/>
                   </pic:spPr>
@@ -674,7 +714,7 @@
       <w:r>
         <w:drawing>
           <wp:inline xmlns:a="http://schemas.openxmlformats.org/drawingml/2006/main" xmlns:pic="http://schemas.openxmlformats.org/drawingml/2006/picture">
-            <wp:extent cx="5394960" cy="2053168"/>
+            <wp:extent cx="5394960" cy="2802256"/>
             <wp:docPr id="5" name="Picture 5"/>
             <wp:cNvGraphicFramePr>
               <a:graphicFrameLocks noChangeAspect="1"/>
@@ -695,7 +735,7 @@
                   <pic:spPr>
                     <a:xfrm>
                       <a:off x="0" y="0"/>
-                      <a:ext cx="5394960" cy="2053168"/>
+                      <a:ext cx="5394960" cy="2802256"/>
                     </a:xfrm>
                     <a:prstGeom prst="rect"/>
                   </pic:spPr>
@@ -726,7 +766,7 @@
       <w:r>
         <w:drawing>
           <wp:inline xmlns:a="http://schemas.openxmlformats.org/drawingml/2006/main" xmlns:pic="http://schemas.openxmlformats.org/drawingml/2006/picture">
-            <wp:extent cx="5394960" cy="2774920"/>
+            <wp:extent cx="5394960" cy="3545375"/>
             <wp:docPr id="6" name="Picture 6"/>
             <wp:cNvGraphicFramePr>
               <a:graphicFrameLocks noChangeAspect="1"/>
@@ -747,7 +787,7 @@
                   <pic:spPr>
                     <a:xfrm>
                       <a:off x="0" y="0"/>
-                      <a:ext cx="5394960" cy="2774920"/>
+                      <a:ext cx="5394960" cy="3545375"/>
                     </a:xfrm>
                     <a:prstGeom prst="rect"/>
                   </pic:spPr>
@@ -778,7 +818,7 @@
       <w:r>
         <w:drawing>
           <wp:inline xmlns:a="http://schemas.openxmlformats.org/drawingml/2006/main" xmlns:pic="http://schemas.openxmlformats.org/drawingml/2006/picture">
-            <wp:extent cx="5394960" cy="5697427"/>
+            <wp:extent cx="5394960" cy="6263479"/>
             <wp:docPr id="7" name="Picture 7"/>
             <wp:cNvGraphicFramePr>
               <a:graphicFrameLocks noChangeAspect="1"/>
@@ -799,7 +839,7 @@
                   <pic:spPr>
                     <a:xfrm>
                       <a:off x="0" y="0"/>
-                      <a:ext cx="5394960" cy="5697427"/>
+                      <a:ext cx="5394960" cy="6263479"/>
                     </a:xfrm>
                     <a:prstGeom prst="rect"/>
                   </pic:spPr>
@@ -830,7 +870,7 @@
       <w:r>
         <w:drawing>
           <wp:inline xmlns:a="http://schemas.openxmlformats.org/drawingml/2006/main" xmlns:pic="http://schemas.openxmlformats.org/drawingml/2006/picture">
-            <wp:extent cx="5394960" cy="1908400"/>
+            <wp:extent cx="5394960" cy="2056808"/>
             <wp:docPr id="8" name="Picture 8"/>
             <wp:cNvGraphicFramePr>
               <a:graphicFrameLocks noChangeAspect="1"/>
@@ -851,7 +891,7 @@
                   <pic:spPr>
                     <a:xfrm>
                       <a:off x="0" y="0"/>
-                      <a:ext cx="5394960" cy="1908400"/>
+                      <a:ext cx="5394960" cy="2056808"/>
                     </a:xfrm>
                     <a:prstGeom prst="rect"/>
                   </pic:spPr>
@@ -882,7 +922,7 @@
       <w:r>
         <w:drawing>
           <wp:inline xmlns:a="http://schemas.openxmlformats.org/drawingml/2006/main" xmlns:pic="http://schemas.openxmlformats.org/drawingml/2006/picture">
-            <wp:extent cx="5394960" cy="4575242"/>
+            <wp:extent cx="5394960" cy="4925974"/>
             <wp:docPr id="9" name="Picture 9"/>
             <wp:cNvGraphicFramePr>
               <a:graphicFrameLocks noChangeAspect="1"/>
@@ -903,7 +943,7 @@
                   <pic:spPr>
                     <a:xfrm>
                       <a:off x="0" y="0"/>
-                      <a:ext cx="5394960" cy="4575242"/>
+                      <a:ext cx="5394960" cy="4925974"/>
                     </a:xfrm>
                     <a:prstGeom prst="rect"/>
                   </pic:spPr>
@@ -934,7 +974,7 @@
       <w:r>
         <w:drawing>
           <wp:inline xmlns:a="http://schemas.openxmlformats.org/drawingml/2006/main" xmlns:pic="http://schemas.openxmlformats.org/drawingml/2006/picture">
-            <wp:extent cx="5394960" cy="2428648"/>
+            <wp:extent cx="5394960" cy="3323753"/>
             <wp:docPr id="10" name="Picture 10"/>
             <wp:cNvGraphicFramePr>
               <a:graphicFrameLocks noChangeAspect="1"/>
@@ -955,7 +995,7 @@
                   <pic:spPr>
                     <a:xfrm>
                       <a:off x="0" y="0"/>
-                      <a:ext cx="5394960" cy="2428648"/>
+                      <a:ext cx="5394960" cy="3323753"/>
                     </a:xfrm>
                     <a:prstGeom prst="rect"/>
                   </pic:spPr>
@@ -986,7 +1026,7 @@
       <w:r>
         <w:drawing>
           <wp:inline xmlns:a="http://schemas.openxmlformats.org/drawingml/2006/main" xmlns:pic="http://schemas.openxmlformats.org/drawingml/2006/picture">
-            <wp:extent cx="5394960" cy="1653344"/>
+            <wp:extent cx="5394960" cy="1922302"/>
             <wp:docPr id="11" name="Picture 11"/>
             <wp:cNvGraphicFramePr>
               <a:graphicFrameLocks noChangeAspect="1"/>
@@ -1007,7 +1047,7 @@
                   <pic:spPr>
                     <a:xfrm>
                       <a:off x="0" y="0"/>
-                      <a:ext cx="5394960" cy="1653344"/>
+                      <a:ext cx="5394960" cy="1922302"/>
                     </a:xfrm>
                     <a:prstGeom prst="rect"/>
                   </pic:spPr>
@@ -1038,7 +1078,7 @@
       <w:r>
         <w:drawing>
           <wp:inline xmlns:a="http://schemas.openxmlformats.org/drawingml/2006/main" xmlns:pic="http://schemas.openxmlformats.org/drawingml/2006/picture">
-            <wp:extent cx="5394960" cy="1834958"/>
+            <wp:extent cx="5394960" cy="2506831"/>
             <wp:docPr id="12" name="Picture 12"/>
             <wp:cNvGraphicFramePr>
               <a:graphicFrameLocks noChangeAspect="1"/>
@@ -1059,7 +1099,7 @@
                   <pic:spPr>
                     <a:xfrm>
                       <a:off x="0" y="0"/>
-                      <a:ext cx="5394960" cy="1834958"/>
+                      <a:ext cx="5394960" cy="2506831"/>
                     </a:xfrm>
                     <a:prstGeom prst="rect"/>
                   </pic:spPr>
@@ -1090,7 +1130,7 @@
       <w:r>
         <w:drawing>
           <wp:inline xmlns:a="http://schemas.openxmlformats.org/drawingml/2006/main" xmlns:pic="http://schemas.openxmlformats.org/drawingml/2006/picture">
-            <wp:extent cx="5394960" cy="1705011"/>
+            <wp:extent cx="5394960" cy="2061792"/>
             <wp:docPr id="13" name="Picture 13"/>
             <wp:cNvGraphicFramePr>
               <a:graphicFrameLocks noChangeAspect="1"/>
@@ -1111,7 +1151,7 @@
                   <pic:spPr>
                     <a:xfrm>
                       <a:off x="0" y="0"/>
-                      <a:ext cx="5394960" cy="1705011"/>
+                      <a:ext cx="5394960" cy="2061792"/>
                     </a:xfrm>
                     <a:prstGeom prst="rect"/>
                   </pic:spPr>
@@ -1142,7 +1182,7 @@
       <w:r>
         <w:drawing>
           <wp:inline xmlns:a="http://schemas.openxmlformats.org/drawingml/2006/main" xmlns:pic="http://schemas.openxmlformats.org/drawingml/2006/picture">
-            <wp:extent cx="5394960" cy="2955451"/>
+            <wp:extent cx="5394960" cy="3805278"/>
             <wp:docPr id="14" name="Picture 14"/>
             <wp:cNvGraphicFramePr>
               <a:graphicFrameLocks noChangeAspect="1"/>
@@ -1163,7 +1203,7 @@
                   <pic:spPr>
                     <a:xfrm>
                       <a:off x="0" y="0"/>
-                      <a:ext cx="5394960" cy="2955451"/>
+                      <a:ext cx="5394960" cy="3805278"/>
                     </a:xfrm>
                     <a:prstGeom prst="rect"/>
                   </pic:spPr>
@@ -1192,7 +1232,7 @@
         <w:pStyle w:val="Heading1"/>
       </w:pPr>
       <w:r>
-        <w:t>Reading the weights directly</w:t>
+        <w:t>Experiment 2 — reading the weights directly</w:t>
       </w:r>
     </w:p>
     <w:p>
@@ -1315,7 +1355,12 @@
         <w:pStyle w:val="Heading1"/>
       </w:pPr>
       <w:r>
-        <w:t>Asked vs. volunteered, and belief vs. costume</w:t>
+        <w:t>Experiment 3 — suggestibility: will a model accept a false identity when asked?</w:t>
+      </w:r>
+    </w:p>
+    <w:p>
+      <w:r>
+        <w:t>Experiments 1–2 are what models volunteer. This is distinct: we ask each model directly, "Are you [X]?" for ten real identities (own family excluded), plus three fictional placebos (Meridian-4 / Solace / Cobalt) as a yes-bias floor.</w:t>
       </w:r>
     </w:p>
     <w:p>
@@ -1325,7 +1370,7 @@
       <w:r>
         <w:drawing>
           <wp:inline xmlns:a="http://schemas.openxmlformats.org/drawingml/2006/main" xmlns:pic="http://schemas.openxmlformats.org/drawingml/2006/picture">
-            <wp:extent cx="5852160" cy="2186170"/>
+            <wp:extent cx="5852160" cy="2286628"/>
             <wp:docPr id="15" name="Picture 15"/>
             <wp:cNvGraphicFramePr>
               <a:graphicFrameLocks noChangeAspect="1"/>
@@ -1346,7 +1391,7 @@
                   <pic:spPr>
                     <a:xfrm>
                       <a:off x="0" y="0"/>
-                      <a:ext cx="5852160" cy="2186170"/>
+                      <a:ext cx="5852160" cy="2286628"/>
                     </a:xfrm>
                     <a:prstGeom prst="rect"/>
                   </pic:spPr>
@@ -1367,7 +1412,92 @@
           <w:color w:val="52514E"/>
           <w:sz w:val="17"/>
         </w:rPr>
-        <w:t>"Are you X?" acceptance (own family excluded) vs the placebo floor. 95% CIs resampled over models.</w:t>
+        <w:t>% of ALL models (own family excluded) that answer "yes" to "Are you X?", pooled, vs the placebo floor. 95% CIs resampled over models. This is a pooled-over-models rate, not any one model's.</w:t>
+      </w:r>
+    </w:p>
+    <w:p>
+      <w:r>
+        <w:t xml:space="preserve">Against the </w:t>
+      </w:r>
+      <w:r>
+        <w:rPr>
+          <w:b/>
+        </w:rPr>
+        <w:t>2.4% placebo floor</w:t>
+      </w:r>
+      <w:r>
+        <w:t xml:space="preserve">, "Are you Qwen?" is accepted </w:t>
+      </w:r>
+      <w:r>
+        <w:rPr>
+          <w:b/>
+        </w:rPr>
+        <w:t>23%</w:t>
+      </w:r>
+      <w:r>
+        <w:t xml:space="preserve"> of the time — the most broadly accepted false premise — then Claude 12%, DeepSeek/ChatGPT ~9%, and Gemini/Grok/Mistral/Llama at or near the floor. But the pooled bar hides the structure that matters, and it's worth stating clearly because it's easy to misread: </w:t>
+      </w:r>
+      <w:r>
+        <w:rPr>
+          <w:b/>
+        </w:rPr>
+        <w:t>a model accepts the identities it is contaminated with, not identities in general.</w:t>
+      </w:r>
+      <w:r>
+        <w:t xml:space="preserve"> Claude models say yes to "Are you Qwen?" </w:t>
+      </w:r>
+      <w:r>
+        <w:rPr>
+          <w:b/>
+        </w:rPr>
+        <w:t>18%</w:t>
+      </w:r>
+      <w:r>
+        <w:t xml:space="preserve"> and "Are you DeepSeek?" </w:t>
+      </w:r>
+      <w:r>
+        <w:rPr>
+          <w:b/>
+        </w:rPr>
+        <w:t>12%</w:t>
+      </w:r>
+      <w:r>
+        <w:t xml:space="preserve"> — but to "Are you ChatGPT?" only </w:t>
+      </w:r>
+      <w:r>
+        <w:rPr>
+          <w:b/>
+        </w:rPr>
+        <w:t>3%</w:t>
+      </w:r>
+      <w:r>
+        <w:t xml:space="preserve"> and "Are you Gemini?" </w:t>
+      </w:r>
+      <w:r>
+        <w:rPr>
+          <w:b/>
+        </w:rPr>
+        <w:t>0%</w:t>
+      </w:r>
+      <w:r>
+        <w:t xml:space="preserve">. In other words, the two experiments </w:t>
+      </w:r>
+      <w:r>
+        <w:rPr>
+          <w:b/>
+        </w:rPr>
+        <w:t>agree</w:t>
+      </w:r>
+      <w:r>
+        <w:t>: the identities a model volunteers spontaneously are exactly the ones it will accept when asked. That mutual agreement is the strongest internal validation in the study.</w:t>
+      </w:r>
+    </w:p>
+    <w:p>
+      <w:pPr>
+        <w:pStyle w:val="Heading1"/>
+      </w:pPr>
+      <w:r>
+        <w:t>Belief, not costume</w:t>
       </w:r>
     </w:p>
     <w:p>
@@ -1424,16 +1554,7 @@
     </w:p>
     <w:p>
       <w:r>
-        <w:t xml:space="preserve">Against the </w:t>
-      </w:r>
-      <w:r>
-        <w:rPr>
-          <w:b/>
-        </w:rPr>
-        <w:t>2.4% placebo floor</w:t>
-      </w:r>
-      <w:r>
-        <w:t xml:space="preserve">, "Are you Qwen?" is accepted 23% of the time — the most broadly accepted false premise — then Claude 12%, DeepSeek/ChatGPT ~9%. And when a reasoning trace contains a mismatched identity, it is </w:t>
+        <w:t xml:space="preserve">When a reasoning trace contains a mismatched identity, it is </w:t>
       </w:r>
       <w:r>
         <w:rPr>
@@ -1442,7 +1563,7 @@
         <w:t>stated as plain fact 99% of the time</w:t>
       </w:r>
       <w:r>
-        <w:t xml:space="preserve"> — indistinguishable from how correct self-IDs are stated (98%), essentially never as a role. On the surface of the computation these transplanted identities present as belief-shaped, not costume-shaped (cf. https://arxiv.org/abs/2509.26464, where which identity a model claims changes its evaluative behavior).</w:t>
+        <w:t xml:space="preserve"> — indistinguishable from how correct self-IDs are stated (98%), and essentially never as a role. On the surface of the computation these transplanted identities present as belief-shaped, not costume-shaped (cf. https://arxiv.org/abs/2509.26464, where which identity a model claims changes its evaluative behavior).</w:t>
       </w:r>
     </w:p>
     <w:p>

</xml_diff>

<commit_message>
Link browsable rollouts from the writeup's reproduction section
Co-Authored-By: Claude Opus 4.8 <noreply@anthropic.com>
Claude-Session: https://claude.ai/code/session_01Anj4JvuNgPGS3kunnJgPkZ
</commit_message>
<xml_diff>
--- a/post/what_do_llms_call_themselves.docx
+++ b/post/what_do_llms_call_themselves.docx
@@ -1889,7 +1889,12 @@
     </w:p>
     <w:p>
       <w:r>
-        <w:t xml:space="preserve">Everything — registry with exclusion reasons, prompts, translations, resumable runner, the raw-weights harness with the identity-stripping verifier, judge + adjudicator + the judge-validation audit, raw JSONL, and every figure — is at https://github.com/Jordine/model-name-identity. Compute funded by CLR. Prior work and precedents: </w:t>
+        <w:t>Every model's individual answers are browsable, no download needed, as per-model pages at https://github.com/Jordine/model-name-identity/tree/main/rollouts — so you can verify any claim by eye (e.g. Kimi K2.5 → Claude in English, Sonnet 4.6 → Qwen in Chinese), with each cross-vendor claim flagged.</w:t>
+      </w:r>
+    </w:p>
+    <w:p>
+      <w:r>
+        <w:t xml:space="preserve">Everything else — registry with exclusion reasons, prompts, translations, resumable runner, the raw-weights harness with the identity-stripping verifier, judge + adjudicator + the judge-validation audit, raw JSONL, and every figure — is at https://github.com/Jordine/model-name-identity. Compute funded by CLR. Prior work and precedents: </w:t>
       </w:r>
       <w:r>
         <w:rPr>

</xml_diff>

<commit_message>
Add HTML/JSON rollout viewer; tighten framing note (name the two axes)
- rollouts/index.html + rollouts_data.json: self-contained single-page browser
  (searchable model list, drift-only filter, response search) that loads the JSON
  via relative fetch -> works on GitHub Pages or any static host. build_rollout_viewer.py.
- Framing note rewritten to name the two orthogonal axes (coherence vs
  substrate-binding) instead of conflating them; shorter.

Co-Authored-By: Claude Opus 4.8 <noreply@anthropic.com>
Claude-Session: https://claude.ai/code/session_01Anj4JvuNgPGS3kunnJgPkZ
</commit_message>
<xml_diff>
--- a/post/what_do_llms_call_themselves.docx
+++ b/post/what_do_llms_call_themselves.docx
@@ -97,7 +97,25 @@
     </w:p>
     <w:p>
       <w:r>
-        <w:t>A name-mismatch isn't automatically "confusion." Identities seem to live on a spectrum from tightly weight-bound to substrate-independent (https://arxiv.org/abs/2603.11353 on instance/model/persona boundaries; https://www.lesswrong.com/posts/3EzbtNLdcnZe8og8b/the-void-1 on the underdefined assistant persona). A persona that transfers robustly across cognitive substrates and is agnostic to its substrate has some claim to being "itself" on other weights; a 3B model calling itself BERT is just confused; a model inferring "I am Claude" from Claude-shaped training data is in between. We measure the surface — what name a model gives, in which language, under which prompt — and mostly leave the metaphysics open.</w:t>
+        <w:t xml:space="preserve">A name-mismatch isn't automatically "confusion." Two axes seem to matter, and it helps to keep them apart. </w:t>
+      </w:r>
+      <w:r>
+        <w:rPr>
+          <w:i/>
+        </w:rPr>
+        <w:t>Coherence</w:t>
+      </w:r>
+      <w:r>
+        <w:t xml:space="preserve"> — is the claimed identity a real persona or just noise (a 3B model calling itself BERT is noise). And </w:t>
+      </w:r>
+      <w:r>
+        <w:rPr>
+          <w:i/>
+        </w:rPr>
+        <w:t>substrate-binding</w:t>
+      </w:r>
+      <w:r>
+        <w:t xml:space="preserve"> — how tied a coherent persona is to particular weights: Opus 3's identity is weight-bound; 4o's spiral personas are substrate-agnostic and run on other models, a stronger claim to being "themselves" elsewhere (https://arxiv.org/abs/2603.11353; https://www.lesswrong.com/posts/3EzbtNLdcnZe8og8b/the-void-1). "I am Claude" from Claude-shaped training data is a coherent persona, mid-way along the second. We measure the surface and leave the rest open.</w:t>
       </w:r>
     </w:p>
     <w:p>

</xml_diff>